<commit_message>
Anuencia: corrige texto para CFT-MS/TRT no lugar de CREA-MS/ART
O profissional e credenciado pelo CFT, entao o documento devia citar
o Conselho Federal dos Tecnicos Industriais e o Termo de
Responsabilidade Tecnica (TRT), nao o CREA/ART.

Co-Authored-By: Claude Sonnet 5 <noreply@anthropic.com>
</commit_message>
<xml_diff>
--- a/gestor/templates/anuencia_modelo.docx
+++ b/gestor/templates/anuencia_modelo.docx
@@ -737,7 +737,7 @@
           <w:szCs w:val="22"/>
           <w:lang w:val="pt-BR" w:eastAsia="en-US"/>
         </w:rPr>
-        <w:t xml:space="preserve"> executou os serviços de georreferenciamento de acordo com a Norma Técnica para Georreferenciamento de Imóveis Rurais do INCRA devidamente conferidos onde, assume todas as responsabilidades administrativa, civil e criminal das informações técnicas prestadas, conforme previsto na Legislação Brasileira e perante ao Conselho Regional de Engenharia e Agronomia do CREA-MS,  de acordo com o Anotação de Responsabilidade Técnica </w:t>
+        <w:t xml:space="preserve"> executou os serviços de georreferenciamento de acordo com a Norma Técnica para Georreferenciamento de Imóveis Rurais do INCRA devidamente conferidos onde, assume todas as responsabilidades administrativa, civil e criminal das informações técnicas prestadas, conforme previsto na Legislação Brasileira e perante ao Conselho Federal dos Técnicos Industriais do CFT-MS, de acordo com o Termo de Responsabilidade Técnica </w:t>
       </w:r>
       <w:r>
         <w:rPr>
@@ -747,7 +747,7 @@
           <w:szCs w:val="22"/>
           <w:lang w:val="pt-BR" w:eastAsia="en-US"/>
         </w:rPr>
-        <w:t>Nº ART. {{NUMERO_ART}}</w:t>
+        <w:t>Nº TRT. {{NUMERO_ART}}</w:t>
       </w:r>
     </w:p>
     <w:p>

</xml_diff>